<commit_message>
game theory experiments module
</commit_message>
<xml_diff>
--- a/docs/Notes_on_Cooperative_N_Person_Game_Theory.docx
+++ b/docs/Notes_on_Cooperative_N_Person_Game_Theory.docx
@@ -9,6 +9,9 @@
       <w:r>
         <w:t xml:space="preserve">Notes on </w:t>
       </w:r>
+      <w:r>
+        <w:t xml:space="preserve">Cooperative </w:t>
+      </w:r>
       <m:oMath>
         <m:r>
           <w:rPr>
@@ -32,7 +35,171 @@
         <w:pStyle w:val="Heading1"/>
       </w:pPr>
       <w:r>
-        <w:t>Characteristic Point Solutions of the Four Person Game</w:t>
+        <w:t xml:space="preserve">Characteristic </w:t>
+      </w:r>
+      <w:r>
+        <w:t xml:space="preserve">Function in Cooperative </w:t>
+      </w:r>
+      <m:oMath>
+        <m:r>
+          <w:rPr>
+            <w:rFonts w:ascii="Cambria Math" w:hAnsi="Cambria Math"/>
+          </w:rPr>
+          <m:t>N</m:t>
+        </m:r>
+      </m:oMath>
+      <w:r>
+        <w:t xml:space="preserve"> Person Games</w:t>
+      </w:r>
+    </w:p>
+    <w:p/>
+    <w:p>
+      <w:r>
+        <w:t xml:space="preserve">The cornerstone of the theory of cooperative </w:t>
+      </w:r>
+      <m:oMath>
+        <m:r>
+          <w:rPr>
+            <w:rFonts w:ascii="Cambria Math" w:hAnsi="Cambria Math"/>
+          </w:rPr>
+          <m:t>N</m:t>
+        </m:r>
+      </m:oMath>
+      <w:r>
+        <w:t>-person games is the characteristic function, a concept first formulated by John von Neumann.</w:t>
+      </w:r>
+      <w:r>
+        <w:t xml:space="preserve"> The idea is to capture in a single numerical index the potential worth of each coalition of players. </w:t>
+      </w:r>
+    </w:p>
+    <w:p/>
+    <w:p>
+      <w:r>
+        <w:t>The characteristic function is, in a sense, the final distillation of the descriptive phase of the theory. Simultaneously, it is a pre-solution – a first, rudimentary attempt at a solution.</w:t>
+      </w:r>
+    </w:p>
+    <w:p>
+      <w:r>
+        <w:t xml:space="preserve">For games that are “inessential” – intuitively, those where no profitable grounds exist for cooperation among players – the characteristic function is already the final solution. </w:t>
+      </w:r>
+      <w:r>
+        <w:t xml:space="preserve">The values of the function tell what each player can expect to get if he plays optimally, while the calculation of those values will (usually) have revealed how to play optimally. </w:t>
+      </w:r>
+      <w:r>
+        <w:t>For essential games, the characteristic function can be regarded as a generalization of the “solution” as this term is generally understood in connection with zero-sum two-person games, in that it provides values and implicitly optimal strategies for coalitions, as well as individuals, on the assumption of no cooperation with outside players.</w:t>
+      </w:r>
+    </w:p>
+    <w:p/>
+    <w:p>
+      <w:pPr>
+        <w:rPr>
+          <w:rFonts w:eastAsiaTheme="minorEastAsia"/>
+        </w:rPr>
+      </w:pPr>
+      <w:r>
+        <w:t xml:space="preserve">Mathematically, the characteristic function </w:t>
+      </w:r>
+      <m:oMath>
+        <m:r>
+          <w:rPr>
+            <w:rFonts w:ascii="Cambria Math" w:hAnsi="Cambria Math"/>
+          </w:rPr>
+          <m:t>v</m:t>
+        </m:r>
+      </m:oMath>
+      <w:r>
+        <w:t xml:space="preserve"> is a function from subsets of players to the real numbers. Hence, only finite list of numbers is involved if we are considering finite-person games. </w:t>
+      </w:r>
+      <w:r>
+        <w:t xml:space="preserve"> The list may be long, since there are </w:t>
+      </w:r>
+      <m:oMath>
+        <m:sSup>
+          <m:sSupPr>
+            <m:ctrlPr>
+              <w:rPr>
+                <w:rFonts w:ascii="Cambria Math" w:hAnsi="Cambria Math"/>
+                <w:i/>
+              </w:rPr>
+            </m:ctrlPr>
+          </m:sSupPr>
+          <m:e>
+            <m:r>
+              <w:rPr>
+                <w:rFonts w:ascii="Cambria Math" w:hAnsi="Cambria Math"/>
+              </w:rPr>
+              <m:t>2</m:t>
+            </m:r>
+          </m:e>
+          <m:sup>
+            <m:r>
+              <w:rPr>
+                <w:rFonts w:ascii="Cambria Math" w:hAnsi="Cambria Math"/>
+              </w:rPr>
+              <m:t>N</m:t>
+            </m:r>
+          </m:sup>
+        </m:sSup>
+        <m:r>
+          <w:rPr>
+            <w:rFonts w:ascii="Cambria Math" w:hAnsi="Cambria Math"/>
+          </w:rPr>
+          <m:t>-1</m:t>
+        </m:r>
+      </m:oMath>
+      <w:r>
+        <w:rPr>
+          <w:rFonts w:eastAsiaTheme="minorEastAsia"/>
+        </w:rPr>
+        <w:t xml:space="preserve"> coalitions to consider in </w:t>
+      </w:r>
+      <m:oMath>
+        <m:r>
+          <w:rPr>
+            <w:rFonts w:ascii="Cambria Math" w:eastAsiaTheme="minorEastAsia" w:hAnsi="Cambria Math"/>
+          </w:rPr>
+          <m:t>N</m:t>
+        </m:r>
+      </m:oMath>
+      <w:r>
+        <w:rPr>
+          <w:rFonts w:eastAsiaTheme="minorEastAsia"/>
+        </w:rPr>
+        <w:t xml:space="preserve"> person game so we would want to explore special properties of the game to reduce this list of candidates.</w:t>
+      </w:r>
+    </w:p>
+    <w:p>
+      <w:pPr>
+        <w:rPr>
+          <w:rFonts w:eastAsiaTheme="minorEastAsia"/>
+        </w:rPr>
+      </w:pPr>
+    </w:p>
+    <w:p>
+      <w:pPr>
+        <w:rPr>
+          <w:rFonts w:eastAsiaTheme="minorEastAsia"/>
+        </w:rPr>
+      </w:pPr>
+      <w:r>
+        <w:rPr>
+          <w:rFonts w:eastAsiaTheme="minorEastAsia"/>
+        </w:rPr>
+        <w:t xml:space="preserve">In Chess for example the characteristic function would state whether the game is a win for White, a win for Black or a draw. </w:t>
+      </w:r>
+    </w:p>
+    <w:p>
+      <w:pPr>
+        <w:rPr>
+          <w:rFonts w:eastAsiaTheme="minorEastAsia"/>
+        </w:rPr>
+      </w:pPr>
+    </w:p>
+    <w:p/>
+    <w:p/>
+    <w:p>
+      <w:r>
+        <w:t xml:space="preserve"> </w:t>
       </w:r>
     </w:p>
     <w:p/>
@@ -582,13 +749,25 @@
         <w:rPr>
           <w:color w:val="EE0000"/>
         </w:rPr>
-        <w:t>4</w:t>
+        <w:t>5</w:t>
       </w:r>
       <w:r>
         <w:rPr>
           <w:color w:val="EE0000"/>
         </w:rPr>
-        <w:t>])</w:t>
+        <w:t>]</w:t>
+      </w:r>
+      <w:r>
+        <w:rPr>
+          <w:color w:val="EE0000"/>
+        </w:rPr>
+        <w:t xml:space="preserve"> and [2]</w:t>
+      </w:r>
+      <w:r>
+        <w:rPr>
+          <w:color w:val="EE0000"/>
+        </w:rPr>
+        <w:t>)</w:t>
       </w:r>
     </w:p>
     <w:p/>
@@ -617,10 +796,23 @@
     </w:p>
     <w:p>
       <w:r>
+        <w:t xml:space="preserve">[2] </w:t>
+      </w:r>
+      <w:hyperlink r:id="rId5" w:history="1">
+        <w:r>
+          <w:rPr>
+            <w:rStyle w:val="Hyperlink"/>
+          </w:rPr>
+          <w:t>Game Theory in Economics – Characteristic Function, Core, and Stable Set, L.S. Shapley and M. Shubik, 1973</w:t>
+        </w:r>
+      </w:hyperlink>
+    </w:p>
+    <w:p>
+      <w:r>
         <w:t>[</w:t>
       </w:r>
       <w:r>
-        <w:t>2</w:t>
+        <w:t>3</w:t>
       </w:r>
       <w:r>
         <w:t>]</w:t>
@@ -628,7 +820,7 @@
       <w:r>
         <w:t xml:space="preserve"> </w:t>
       </w:r>
-      <w:hyperlink r:id="rId5" w:history="1">
+      <w:hyperlink r:id="rId6" w:history="1">
         <w:r>
           <w:rPr>
             <w:rStyle w:val="Hyperlink"/>
@@ -642,12 +834,12 @@
         <w:t>[</w:t>
       </w:r>
       <w:r>
-        <w:t>3</w:t>
+        <w:t>4</w:t>
       </w:r>
       <w:r>
         <w:t xml:space="preserve">] </w:t>
       </w:r>
-      <w:hyperlink r:id="rId6" w:history="1">
+      <w:hyperlink r:id="rId7" w:history="1">
         <w:r>
           <w:rPr>
             <w:rStyle w:val="Hyperlink"/>
@@ -661,12 +853,12 @@
         <w:t>[</w:t>
       </w:r>
       <w:r>
-        <w:t>4</w:t>
+        <w:t>5</w:t>
       </w:r>
       <w:r>
         <w:t xml:space="preserve">] </w:t>
       </w:r>
-      <w:hyperlink r:id="rId7" w:history="1">
+      <w:hyperlink r:id="rId8" w:history="1">
         <w:r>
           <w:rPr>
             <w:rStyle w:val="Hyperlink"/>
@@ -692,7 +884,7 @@
         <w:t>[</w:t>
       </w:r>
       <w:r>
-        <w:t>5</w:t>
+        <w:t>6</w:t>
       </w:r>
       <w:r>
         <w:t>]</w:t>
@@ -700,7 +892,7 @@
       <w:r>
         <w:t xml:space="preserve"> </w:t>
       </w:r>
-      <w:hyperlink r:id="rId8" w:history="1">
+      <w:hyperlink r:id="rId9" w:history="1">
         <w:r>
           <w:rPr>
             <w:rStyle w:val="Hyperlink"/>
@@ -729,12 +921,12 @@
         <w:t>[</w:t>
       </w:r>
       <w:r>
-        <w:t>6</w:t>
+        <w:t>7</w:t>
       </w:r>
       <w:r>
         <w:t xml:space="preserve">] </w:t>
       </w:r>
-      <w:hyperlink r:id="rId9" w:history="1">
+      <w:hyperlink r:id="rId10" w:history="1">
         <w:r>
           <w:rPr>
             <w:rStyle w:val="Hyperlink"/>
@@ -748,12 +940,12 @@
         <w:t>[</w:t>
       </w:r>
       <w:r>
-        <w:t>7</w:t>
+        <w:t>8</w:t>
       </w:r>
       <w:r>
         <w:t xml:space="preserve">] </w:t>
       </w:r>
-      <w:hyperlink r:id="rId10" w:history="1">
+      <w:hyperlink r:id="rId11" w:history="1">
         <w:r>
           <w:rPr>
             <w:rStyle w:val="Hyperlink"/>

</xml_diff>